<commit_message>
Paquetes docentes separados por perfil y resumen del diagnóstico por perfil
Temario, guía de contenido, guía de casos y ajustes con solo el perfil de
cada docente. Resumen del diagnóstico con cifras agregadas del perfil.

Co-Authored-By: Claude Opus 5.5 <noreply@anthropic.com>
Claude-Session: https://claude.ai/code/session_01Ja1vbRoiAwxTq3mLFGrVau
</commit_message>
<xml_diff>
--- a/docentes/administrativo/Paquete del docente · perfil administrativo.docx
+++ b/docentes/administrativo/Paquete del docente · perfil administrativo.docx
@@ -4697,7 +4697,7 @@
           <w:sz w:val="21"/>
           <w:szCs w:val="21"/>
         </w:rPr>
-        <w:t xml:space="preserve">El temario detallado trae cada taller completo: objetivo, competencias, temáticas, casos, herramientas, ejercicios, evaluación y errores que vigilar. La guía de contenido dice cómo se arma: bloques, diapositivas y lo que no puede faltar de T2 a T6. Esta tabla resume el mapa y conecta cada taller con su sesión de Teams y con los retos de los jueves que lo refuerzan.</w:t>
+        <w:t xml:space="preserve">El temario de tu perfil trae cada taller completo: objetivo, competencias, temáticas, casos, herramientas, ejercicios, evaluación y errores que vigilar. La guía de contenido dice cómo se arma: bloques, diapositivas y lo que no puede faltar de T2 a T6. Esta tabla resume el mapa y conecta cada taller con su sesión de Teams y con los retos de los jueves que lo refuerzan.</w:t>
       </w:r>
     </w:p>
     <w:tbl>
@@ -6077,7 +6077,7 @@
           <w:sz w:val="21"/>
           <w:szCs w:val="21"/>
         </w:rPr>
-        <w:t xml:space="preserve">Resultados parciales con corte del 14 de octubre, 415 personas con índice completo. Los ajustes taller por taller están en «Ajustes a los talleres», sección 5. Los que más pesan en tu preparación:</w:t>
+        <w:t xml:space="preserve">Resultados parciales con corte del 14 de octubre, 415 personas con índice completo. Los ajustes taller por taller están en «Ajustes a los talleres · perfil administrativo», sección 4, y el resumen completo en «Resumen del diagnóstico · perfil administrativo». Los que más pesan en tu preparación:</w:t>
       </w:r>
     </w:p>
     <w:p>
@@ -6255,7 +6255,7 @@
                 <w:sz w:val="20"/>
                 <w:szCs w:val="20"/>
               </w:rPr>
-              <w:t xml:space="preserve">El paquete trae los resultados agregados por perfil. Los nombres, las empresas y los puntajes de cada persona quedan con la dirección del programa. Cuando necesites un dato por grupo o por sede, pídelo a Jessica Peña.</w:t>
+              <w:t xml:space="preserve">El paquete trae los resultados agregados de tu perfil. Los nombres, las empresas y los puntajes de cada persona quedan con la dirección del programa. Cuando necesites un dato por grupo o por sede, pídelo a Jessica Peña.</w:t>
             </w:r>
           </w:p>
         </w:tc>
@@ -7100,7 +7100,7 @@
                 <w:sz w:val="19"/>
                 <w:szCs w:val="19"/>
               </w:rPr>
-              <w:t xml:space="preserve">Temario detallado de los 12 talleres</w:t>
+              <w:t xml:space="preserve">Temario detallado · perfil administrativo</w:t>
             </w:r>
           </w:p>
         </w:tc>
@@ -7131,7 +7131,7 @@
                 <w:sz w:val="19"/>
                 <w:szCs w:val="19"/>
               </w:rPr>
-              <w:t xml:space="preserve">Contenido completo de cada taller. Lee los seis de tu perfil y los seis del otro, para que los dos programas se hablen.</w:t>
+              <w:t xml:space="preserve">Contenido completo de tus seis talleres, con los elementos del método, las herramientas, los casos de tu perfil y los retos de los jueves.</w:t>
             </w:r>
           </w:p>
         </w:tc>
@@ -7167,7 +7167,7 @@
                 <w:sz w:val="19"/>
                 <w:szCs w:val="19"/>
               </w:rPr>
-              <w:t xml:space="preserve">Guía de contenido por taller</w:t>
+              <w:t xml:space="preserve">Resumen del diagnóstico · perfil administrativo</w:t>
             </w:r>
           </w:p>
         </w:tc>
@@ -7198,7 +7198,7 @@
                 <w:sz w:val="19"/>
                 <w:szCs w:val="19"/>
               </w:rPr>
-              <w:t xml:space="preserve">Bloques, minutos y diapositivas de cada encuentro; mapa del Taller 1; lo que no puede faltar de T2 a T6; checklist de entrega. Las fechas que trae están superadas por este documento.</w:t>
+              <w:t xml:space="preserve">Lo que el diagnóstico encontró en tu perfil: índices, situaciones que resolvió bien y mal, uso de IA, cómo trabaja hoy, condiciones de conexión, grupos y qué cambia en tus talleres.</w:t>
             </w:r>
           </w:p>
         </w:tc>
@@ -7234,7 +7234,7 @@
                 <w:sz w:val="19"/>
                 <w:szCs w:val="19"/>
               </w:rPr>
-              <w:t xml:space="preserve">Guía de casos de G&amp;J</w:t>
+              <w:t xml:space="preserve">Guía de contenido · perfil administrativo</w:t>
             </w:r>
           </w:p>
         </w:tc>
@@ -7265,7 +7265,7 @@
                 <w:sz w:val="19"/>
                 <w:szCs w:val="19"/>
               </w:rPr>
-              <w:t xml:space="preserve">Los casos reales de las mesas de trabajo, con su dato. Cada demostración toma uno de aquí.</w:t>
+              <w:t xml:space="preserve">Bloques, minutos y diapositivas de cada encuentro; mapa de tu Taller 1; lo que no puede faltar de T2 a T6; checklist de entrega.</w:t>
             </w:r>
           </w:p>
         </w:tc>
@@ -7301,7 +7301,7 @@
                 <w:sz w:val="19"/>
                 <w:szCs w:val="19"/>
               </w:rPr>
-              <w:t xml:space="preserve">Kit del docente</w:t>
+              <w:t xml:space="preserve">Guía de casos de G&amp;J · perfil administrativo</w:t>
             </w:r>
           </w:p>
         </w:tc>
@@ -7332,7 +7332,7 @@
                 <w:sz w:val="19"/>
                 <w:szCs w:val="19"/>
               </w:rPr>
-              <w:t xml:space="preserve">Formato «Mi proceso», estructura de la evaluación, prompts base y piezas que se repiten en todos los talleres.</w:t>
+              <w:t xml:space="preserve">Los casos reales de las mesas de trabajo que se usan en tu perfil, con su dato. Cada demostración toma uno de aquí.</w:t>
             </w:r>
           </w:p>
         </w:tc>
@@ -7368,7 +7368,7 @@
                 <w:sz w:val="19"/>
                 <w:szCs w:val="19"/>
               </w:rPr>
-              <w:t xml:space="preserve">Manual de puntajes y reconocimiento</w:t>
+              <w:t xml:space="preserve">Kit del docente</w:t>
             </w:r>
           </w:p>
         </w:tc>
@@ -7399,7 +7399,7 @@
                 <w:sz w:val="19"/>
                 <w:szCs w:val="19"/>
               </w:rPr>
-              <w:t xml:space="preserve">Cómo suman puntos la asistencia, los retos, la evaluación y «Mi proceso». Lo que anuncias en la apertura y en el cierre.</w:t>
+              <w:t xml:space="preserve">Formato «Mi proceso», estructura de la evaluación, prompts base y piezas que se repiten en todos los talleres.</w:t>
             </w:r>
           </w:p>
         </w:tc>
@@ -7435,7 +7435,7 @@
                 <w:sz w:val="19"/>
                 <w:szCs w:val="19"/>
               </w:rPr>
-              <w:t xml:space="preserve">Ajustes a los talleres · diagnóstico y política de IA</w:t>
+              <w:t xml:space="preserve">Manual de puntajes y reconocimiento</w:t>
             </w:r>
           </w:p>
         </w:tc>
@@ -7466,7 +7466,74 @@
                 <w:sz w:val="19"/>
                 <w:szCs w:val="19"/>
               </w:rPr>
-              <w:t xml:space="preserve">Lo que cambia en cada taller a partir del diagnóstico y de la política. Sección 3 para todos; sección 5 para tu perfil; sección 6 para los retos.</w:t>
+              <w:t xml:space="preserve">Cómo suman puntos la asistencia, los retos, la evaluación y «Mi proceso». Lo que anuncias en la apertura y en el cierre.</w:t>
+            </w:r>
+          </w:p>
+        </w:tc>
+      </w:tr>
+      <w:tr>
+        <w:trPr>
+          <w:cantSplit/>
+        </w:trPr>
+        <w:tc>
+          <w:tcPr>
+            <w:tcW w:type="dxa" w:w="3590"/>
+            <w:tcBorders>
+              <w:top w:val="single" w:color="DEDED9" w:sz="6"/>
+              <w:left w:val="none" w:color="FFFFFF" w:sz="0"/>
+              <w:bottom w:val="single" w:color="DEDED9" w:sz="6"/>
+              <w:right w:val="none" w:color="FFFFFF" w:sz="0"/>
+            </w:tcBorders>
+            <w:tcMar>
+              <w:top w:type="dxa" w:w="80"/>
+              <w:left w:type="dxa" w:w="110"/>
+              <w:bottom w:type="dxa" w:w="80"/>
+              <w:right w:type="dxa" w:w="110"/>
+            </w:tcMar>
+          </w:tcPr>
+          <w:p>
+            <w:pPr>
+              <w:spacing w:after="40" w:line="260"/>
+            </w:pPr>
+            <w:r>
+              <w:rPr>
+                <w:rFonts w:ascii="Atkinson Hyperlegible Next" w:cs="Atkinson Hyperlegible Next" w:eastAsia="Atkinson Hyperlegible Next" w:hAnsi="Atkinson Hyperlegible Next"/>
+                <w:color w:val="0D0D0C"/>
+                <w:sz w:val="19"/>
+                <w:szCs w:val="19"/>
+              </w:rPr>
+              <w:t xml:space="preserve">Ajustes a los talleres · perfil administrativo</w:t>
+            </w:r>
+          </w:p>
+        </w:tc>
+        <w:tc>
+          <w:tcPr>
+            <w:tcW w:type="dxa" w:w="6382"/>
+            <w:tcBorders>
+              <w:top w:val="single" w:color="DEDED9" w:sz="6"/>
+              <w:left w:val="none" w:color="FFFFFF" w:sz="0"/>
+              <w:bottom w:val="single" w:color="DEDED9" w:sz="6"/>
+              <w:right w:val="none" w:color="FFFFFF" w:sz="0"/>
+            </w:tcBorders>
+            <w:tcMar>
+              <w:top w:type="dxa" w:w="80"/>
+              <w:left w:type="dxa" w:w="110"/>
+              <w:bottom w:type="dxa" w:w="80"/>
+              <w:right w:type="dxa" w:w="110"/>
+            </w:tcMar>
+          </w:tcPr>
+          <w:p>
+            <w:pPr>
+              <w:spacing w:after="40" w:line="260"/>
+            </w:pPr>
+            <w:r>
+              <w:rPr>
+                <w:rFonts w:ascii="Atkinson Hyperlegible Next" w:cs="Atkinson Hyperlegible Next" w:eastAsia="Atkinson Hyperlegible Next" w:hAnsi="Atkinson Hyperlegible Next"/>
+                <w:color w:val="0D0D0C"/>
+                <w:sz w:val="19"/>
+                <w:szCs w:val="19"/>
+              </w:rPr>
+              <w:t xml:space="preserve">Lo que cambia en cada taller a partir del diagnóstico y de la política. Sección 3 para los seis talleres, sección 4 taller por taller, sección 5 para los retos.</w:t>
             </w:r>
           </w:p>
         </w:tc>
@@ -8182,7 +8249,7 @@
                 <w:sz w:val="20"/>
                 <w:szCs w:val="20"/>
               </w:rPr>
-              <w:t xml:space="preserve">Lee el Taller 1 de tu perfil en el temario y en la guía de contenido, elige el caso de la demostración en la guía de casos y envía el guion a Jessica Peña el martes 20 oct de octubre. La prueba técnica del Taller 1 se agenda en Teams en la fecha de la tabla de la sección 2.</w:t>
+              <w:t xml:space="preserve">Lee el resumen del diagnóstico, el Taller 1 en el temario y en la guía de contenido, elige el caso de la demostración en la guía de casos y envía el guion a Jessica Peña el martes 20 oct de octubre. La prueba técnica del Taller 1 se agenda en Teams en la fecha de la tabla de la sección 2.</w:t>
             </w:r>
           </w:p>
         </w:tc>

</xml_diff>